<commit_message>
Move docs to docs/old and add template
Archive many documentation files by moving them into docs/old, remove an editor lock and an obsolete prototype report, and update binary documents. Added new MOD_AEB_EP_40.2_TGPSI_modelo_autoavaliacao_fase_desenvolvimento_PAP_finalB4.docx and updated B4_relatorio_projeto_Final_PAP_53452.docx; several old/archived docx files were replaced or updated under docs/old as part of repository cleanup.
</commit_message>
<xml_diff>
--- a/docs/B4_relatorio_projeto_Final_PAP_53452.docx
+++ b/docs/B4_relatorio_projeto_Final_PAP_53452.docx
@@ -7255,7 +7255,9 @@
         <w:pBdr/>
         <w:spacing w:after="80" w:before="80"/>
         <w:ind/>
-        <w:rPr/>
+        <w:rPr>
+          <w:highlight w:val="none"/>
+        </w:rPr>
       </w:pPr>
       <w:r>
         <w:rPr>
@@ -7273,19 +7275,107 @@
           <w:sz w:val="24"/>
           <w:szCs w:val="24"/>
         </w:rPr>
-        <w:t xml:space="preserve">parada uma demonstração em vídeo mostrando: compilação, arranque do servidor, ligação VPN, autenticação na TUI, navegação, download, upload, eliminação e criação de pastas/ficheiros. O vídeo pode ser solicitado ao autor ou consultado no repositório GitHub.</w:t>
+        <w:t xml:space="preserve">parada uma demonstração em vídeo mostrando: compilação, arranque do servidor, ligação VPN, autenticação na TUI, navegação, download, upload, eliminação e criação de pastas/ficheiros. O vídeo pode ser solicitado ao autor ou consultado n</w:t>
       </w:r>
+      <w:r>
+        <w:rPr>
+          <w:rFonts w:ascii="Arial" w:hAnsi="Arial" w:eastAsia="Arial" w:cs="Arial"/>
+          <w:color w:val="000000"/>
+          <w:sz w:val="24"/>
+          <w:szCs w:val="24"/>
+          <w:lang w:val="pt-BR"/>
+        </w:rPr>
+        <w:t xml:space="preserve">este link</w:t>
+      </w:r>
+      <w:r>
+        <w:rPr>
+          <w:rFonts w:ascii="Arial" w:hAnsi="Arial" w:eastAsia="Arial" w:cs="Arial"/>
+          <w:color w:val="000000"/>
+          <w:sz w:val="24"/>
+          <w:szCs w:val="24"/>
+          <w:lang w:val="pt-BR"/>
+        </w:rPr>
+        <w:t xml:space="preserve">: </w:t>
+      </w:r>
+      <w:r>
+        <w:rPr>
+          <w:rFonts w:ascii="Arial" w:hAnsi="Arial" w:eastAsia="Arial" w:cs="Arial"/>
+          <w:color w:val="000000"/>
+          <w:sz w:val="24"/>
+          <w:szCs w:val="24"/>
+          <w:lang w:val="pt-BR"/>
+        </w:rPr>
+      </w:r>
+      <w:hyperlink r:id="rId13" w:tooltip="https://drive.google.com/file/d/1wbMK9pkm5rphgW0GtwQhacieq2s9KEAf/view?usp=drive_link" w:history="1">
+        <w:r>
+          <w:rPr>
+            <w:rStyle w:val="1077"/>
+            <w:rFonts w:ascii="Arial" w:hAnsi="Arial" w:eastAsia="Arial" w:cs="Arial"/>
+            <w:sz w:val="24"/>
+            <w:szCs w:val="24"/>
+            <w:lang w:val="pt-BR"/>
+          </w:rPr>
+          <w:t xml:space="preserve">https://drive.google.com/file/d/1wbMK9pkm5rphgW0GtwQhacieq2s9KEAf/view?usp=drive_link</w:t>
+        </w:r>
+        <w:r>
+          <w:rPr>
+            <w:rStyle w:val="1077"/>
+            <w:rFonts w:ascii="Arial" w:hAnsi="Arial" w:eastAsia="Arial" w:cs="Arial"/>
+            <w:sz w:val="24"/>
+            <w:szCs w:val="24"/>
+            <w:lang w:val="pt-BR"/>
+          </w:rPr>
+        </w:r>
+        <w:r>
+          <w:rPr>
+            <w:rStyle w:val="1077"/>
+          </w:rPr>
+        </w:r>
+      </w:hyperlink>
       <w:r/>
+      <w:r>
+        <w:rPr>
+          <w:rFonts w:ascii="Arial" w:hAnsi="Arial" w:eastAsia="Arial" w:cs="Arial"/>
+          <w:color w:val="000000"/>
+          <w:sz w:val="24"/>
+          <w:szCs w:val="24"/>
+          <w:highlight w:val="none"/>
+          <w:lang w:val="pt-BR"/>
+        </w:rPr>
+      </w:r>
     </w:p>
     <w:p>
       <w:pPr>
         <w:pBdr/>
-        <w:spacing w:after="0" w:before="0"/>
-        <w:ind/>
-        <w:rPr/>
-      </w:pPr>
-      <w:r/>
-      <w:r/>
+        <w:spacing w:after="80" w:before="80"/>
+        <w:ind/>
+        <w:rPr>
+          <w:rFonts w:ascii="Arial" w:hAnsi="Arial" w:eastAsia="Arial" w:cs="Arial"/>
+          <w:color w:val="000000"/>
+          <w:sz w:val="24"/>
+          <w:szCs w:val="24"/>
+          <w:highlight w:val="none"/>
+          <w:lang w:val="pt-BR"/>
+        </w:rPr>
+      </w:pPr>
+      <w:r>
+        <w:rPr>
+          <w:highlight w:val="none"/>
+          <w:lang w:val="pt-BR" w:bidi="pt-BR"/>
+        </w:rPr>
+      </w:r>
+      <w:r>
+        <w:rPr>
+          <w:highlight w:val="none"/>
+          <w:lang w:val="pt-BR" w:bidi="pt-BR"/>
+        </w:rPr>
+      </w:r>
+      <w:r>
+        <w:rPr>
+          <w:highlight w:val="none"/>
+          <w:lang w:val="pt-BR"/>
+        </w:rPr>
+      </w:r>
     </w:p>
     <w:p>
       <w:pPr>

</xml_diff>